<commit_message>
Update 5. Deployment Pipelines.docx
</commit_message>
<xml_diff>
--- a/Day 4/Labs/5. Deployment Pipelines.docx
+++ b/Day 4/Labs/5. Deployment Pipelines.docx
@@ -137,6 +137,9 @@
         <w:ind w:left="1440"/>
       </w:pPr>
       <w:r>
+        <w:rPr>
+          <w:noProof/>
+        </w:rPr>
         <w:drawing>
           <wp:inline distT="0" distB="0" distL="0" distR="0" wp14:anchorId="2DCDE5CF" wp14:editId="4343FCE3">
             <wp:extent cx="3728379" cy="5467350"/>
@@ -218,6 +221,9 @@
         </w:numPr>
       </w:pPr>
       <w:r>
+        <w:rPr>
+          <w:noProof/>
+        </w:rPr>
         <w:lastRenderedPageBreak/>
         <w:drawing>
           <wp:inline distT="0" distB="0" distL="0" distR="0" wp14:anchorId="521909DA" wp14:editId="1DD448B3">
@@ -289,6 +295,9 @@
         </w:numPr>
       </w:pPr>
       <w:r>
+        <w:rPr>
+          <w:noProof/>
+        </w:rPr>
         <w:drawing>
           <wp:inline distT="0" distB="0" distL="0" distR="0" wp14:anchorId="69ABFA04" wp14:editId="641EDA7C">
             <wp:extent cx="3938616" cy="2895621"/>
@@ -353,6 +362,9 @@
         <w:pStyle w:val="ListParagraph"/>
       </w:pPr>
       <w:r>
+        <w:rPr>
+          <w:noProof/>
+        </w:rPr>
         <w:drawing>
           <wp:inline distT="0" distB="0" distL="0" distR="0" wp14:anchorId="495DD726" wp14:editId="0B21E10D">
             <wp:extent cx="1681163" cy="655820"/>
@@ -419,6 +431,9 @@
         <w:pStyle w:val="ListParagraph"/>
       </w:pPr>
       <w:r>
+        <w:rPr>
+          <w:noProof/>
+        </w:rPr>
         <w:lastRenderedPageBreak/>
         <w:drawing>
           <wp:inline distT="0" distB="0" distL="0" distR="0" wp14:anchorId="59B7C630" wp14:editId="4D4C1979">
@@ -470,6 +485,9 @@
         <w:pStyle w:val="ListParagraph"/>
       </w:pPr>
       <w:r>
+        <w:rPr>
+          <w:noProof/>
+        </w:rPr>
         <w:drawing>
           <wp:inline distT="0" distB="0" distL="0" distR="0" wp14:anchorId="22E52E95" wp14:editId="49DD2071">
             <wp:extent cx="5076825" cy="1721148"/>
@@ -553,6 +571,9 @@
         <w:pStyle w:val="ListParagraph"/>
       </w:pPr>
       <w:r>
+        <w:rPr>
+          <w:noProof/>
+        </w:rPr>
         <w:drawing>
           <wp:inline distT="0" distB="0" distL="0" distR="0" wp14:anchorId="02F4120C" wp14:editId="7E4611B5">
             <wp:extent cx="5076825" cy="2464729"/>
@@ -604,6 +625,112 @@
       <w:r>
         <w:t>Click tick icon to save it</w:t>
       </w:r>
+    </w:p>
+    <w:p>
+      <w:pPr>
+        <w:pStyle w:val="ListParagraph"/>
+      </w:pPr>
+    </w:p>
+    <w:p>
+      <w:pPr>
+        <w:pStyle w:val="ListParagraph"/>
+      </w:pPr>
+      <w:r>
+        <w:t xml:space="preserve">Go to Test </w:t>
+      </w:r>
+      <w:r>
+        <w:t xml:space="preserve">deployment </w:t>
+      </w:r>
+    </w:p>
+    <w:p>
+      <w:pPr>
+        <w:pStyle w:val="ListParagraph"/>
+      </w:pPr>
+      <w:r>
+        <w:t>Select the files and click deploy</w:t>
+      </w:r>
+    </w:p>
+    <w:p>
+      <w:pPr>
+        <w:pStyle w:val="ListParagraph"/>
+      </w:pPr>
+      <w:r>
+        <w:rPr>
+          <w:noProof/>
+        </w:rPr>
+        <w:lastRenderedPageBreak/>
+        <w:drawing>
+          <wp:inline distT="0" distB="0" distL="0" distR="0" wp14:anchorId="2DCE7F0A" wp14:editId="53F4C062">
+            <wp:extent cx="4905375" cy="2497579"/>
+            <wp:effectExtent l="0" t="0" r="0" b="0"/>
+            <wp:docPr id="1947717892" name="Picture 1"/>
+            <wp:cNvGraphicFramePr>
+              <a:graphicFrameLocks xmlns:a="http://schemas.openxmlformats.org/drawingml/2006/main" noChangeAspect="1"/>
+            </wp:cNvGraphicFramePr>
+            <a:graphic xmlns:a="http://schemas.openxmlformats.org/drawingml/2006/main">
+              <a:graphicData uri="http://schemas.openxmlformats.org/drawingml/2006/picture">
+                <pic:pic xmlns:pic="http://schemas.openxmlformats.org/drawingml/2006/picture">
+                  <pic:nvPicPr>
+                    <pic:cNvPr id="0" name="Picture 1"/>
+                    <pic:cNvPicPr>
+                      <a:picLocks noChangeAspect="1" noChangeArrowheads="1"/>
+                    </pic:cNvPicPr>
+                  </pic:nvPicPr>
+                  <pic:blipFill>
+                    <a:blip r:embed="rId13" cstate="print">
+                      <a:extLst>
+                        <a:ext uri="{28A0092B-C50C-407E-A947-70E740481C1C}">
+                          <a14:useLocalDpi xmlns:a14="http://schemas.microsoft.com/office/drawing/2010/main" val="0"/>
+                        </a:ext>
+                      </a:extLst>
+                    </a:blip>
+                    <a:srcRect/>
+                    <a:stretch>
+                      <a:fillRect/>
+                    </a:stretch>
+                  </pic:blipFill>
+                  <pic:spPr bwMode="auto">
+                    <a:xfrm>
+                      <a:off x="0" y="0"/>
+                      <a:ext cx="4912888" cy="2501404"/>
+                    </a:xfrm>
+                    <a:prstGeom prst="rect">
+                      <a:avLst/>
+                    </a:prstGeom>
+                    <a:noFill/>
+                    <a:ln>
+                      <a:noFill/>
+                    </a:ln>
+                  </pic:spPr>
+                </pic:pic>
+              </a:graphicData>
+            </a:graphic>
+          </wp:inline>
+        </w:drawing>
+      </w:r>
+    </w:p>
+    <w:p>
+      <w:pPr>
+        <w:pStyle w:val="ListParagraph"/>
+      </w:pPr>
+    </w:p>
+    <w:p>
+      <w:pPr>
+        <w:pStyle w:val="ListParagraph"/>
+      </w:pPr>
+      <w:r>
+        <w:t>Add the Data source connection and Gateway</w:t>
+      </w:r>
+    </w:p>
+    <w:p>
+      <w:pPr>
+        <w:pStyle w:val="ListParagraph"/>
+      </w:pPr>
+    </w:p>
+    <w:p>
+      <w:pPr>
+        <w:pStyle w:val="ListParagraph"/>
+      </w:pPr>
     </w:p>
     <w:p>
       <w:pPr>

</xml_diff>